<commit_message>
Added Wayback machine to piuck up failed articles
</commit_message>
<xml_diff>
--- a/STEPS.docx
+++ b/STEPS.docx
@@ -5,20 +5,158 @@
     <w:p>
       <w:pPr>
         <w:rPr>
+          <w:lang w:val="en-US"/>
+        </w:rPr>
+      </w:pPr>
+      <w:r>
+        <w:rPr>
+          <w:lang w:val="en-US"/>
+        </w:rPr>
+        <w:t>Tue 17 Mar steps:</w:t>
+      </w:r>
+    </w:p>
+    <w:p>
+      <w:pPr>
+        <w:rPr>
+          <w:lang w:val="en-US"/>
+        </w:rPr>
+      </w:pPr>
+    </w:p>
+    <w:p>
+      <w:pPr>
+        <w:pStyle w:val="ListParagraph"/>
+        <w:numPr>
+          <w:ilvl w:val="0"/>
+          <w:numId w:val="3"/>
+        </w:numPr>
+        <w:rPr>
+          <w:lang w:val="en-US"/>
+        </w:rPr>
+      </w:pPr>
+      <w:r>
+        <w:rPr>
+          <w:lang w:val="en-US"/>
+        </w:rPr>
+        <w:t>Check ‘link rot’ issue across 2 more random weeks in 2016 &amp; 2022</w:t>
+      </w:r>
+    </w:p>
+    <w:p>
+      <w:pPr>
+        <w:pStyle w:val="ListParagraph"/>
+        <w:numPr>
+          <w:ilvl w:val="0"/>
+          <w:numId w:val="3"/>
+        </w:numPr>
+        <w:rPr>
+          <w:lang w:val="en-US"/>
+        </w:rPr>
+      </w:pPr>
+      <w:r>
+        <w:rPr>
+          <w:lang w:val="en-US"/>
+        </w:rPr>
+        <w:t>Check I can do everything else on my laptop while running on 4 more years</w:t>
+      </w:r>
+    </w:p>
+    <w:p>
+      <w:pPr>
+        <w:pStyle w:val="ListParagraph"/>
+        <w:numPr>
+          <w:ilvl w:val="1"/>
+          <w:numId w:val="3"/>
+        </w:numPr>
+        <w:rPr>
+          <w:lang w:val="en-US"/>
+        </w:rPr>
+      </w:pPr>
+      <w:r>
+        <w:rPr>
+          <w:lang w:val="en-US"/>
+        </w:rPr>
+        <w:t xml:space="preserve">Locally yes, AWS be careful due to memory constraints. </w:t>
+      </w:r>
+    </w:p>
+    <w:p>
+      <w:pPr>
+        <w:pStyle w:val="ListParagraph"/>
+        <w:numPr>
+          <w:ilvl w:val="0"/>
+          <w:numId w:val="3"/>
+        </w:numPr>
+        <w:rPr>
+          <w:lang w:val="en-US"/>
+        </w:rPr>
+      </w:pPr>
+      <w:r>
+        <w:rPr>
+          <w:lang w:val="en-US"/>
+        </w:rPr>
+        <w:t>Check my S3 storage isn’t going to overwrite my current files</w:t>
+      </w:r>
+    </w:p>
+    <w:p>
+      <w:pPr>
+        <w:pStyle w:val="ListParagraph"/>
+        <w:numPr>
+          <w:ilvl w:val="0"/>
+          <w:numId w:val="3"/>
+        </w:numPr>
+        <w:rPr>
+          <w:lang w:val="en-US"/>
+        </w:rPr>
+      </w:pPr>
+      <w:r>
+        <w:rPr>
+          <w:lang w:val="en-US"/>
+        </w:rPr>
+        <w:t>Run on 2021 – 2025</w:t>
+      </w:r>
+    </w:p>
+    <w:p>
+      <w:pPr>
+        <w:pStyle w:val="ListParagraph"/>
+        <w:numPr>
+          <w:ilvl w:val="0"/>
+          <w:numId w:val="3"/>
+        </w:numPr>
+        <w:rPr>
+          <w:lang w:val="en-US"/>
+        </w:rPr>
+      </w:pPr>
+      <w:r>
+        <w:rPr>
+          <w:lang w:val="en-US"/>
+        </w:rPr>
+        <w:t>Get cracking on global mining natural disasters!</w:t>
+      </w:r>
+    </w:p>
+    <w:p>
+      <w:pPr>
+        <w:rPr>
           <w:b/>
           <w:bCs/>
           <w:u w:val="single"/>
           <w:lang w:val="en-US"/>
         </w:rPr>
       </w:pPr>
-      <w:r>
+    </w:p>
+    <w:p>
+      <w:pPr>
         <w:rPr>
           <w:b/>
           <w:bCs/>
           <w:u w:val="single"/>
           <w:lang w:val="en-US"/>
         </w:rPr>
-        <w:t>Running on one year 15.03.2026</w:t>
+      </w:pPr>
+      <w:r>
+        <w:rPr>
+          <w:b/>
+          <w:bCs/>
+          <w:u w:val="single"/>
+          <w:lang w:val="en-US"/>
+        </w:rPr>
+        <w:t>Running on one year</w:t>
       </w:r>
     </w:p>
     <w:p>
@@ -31,7 +169,7 @@
         <w:rPr>
           <w:lang w:val="en-US"/>
         </w:rPr>
-        <w:t>Run period: 2025-03-11 – 2026-03-11</w:t>
+        <w:t>Run period: 2025-03-11 – 2026-03-10</w:t>
       </w:r>
     </w:p>
     <w:p>
@@ -44,7 +182,7 @@
         <w:rPr>
           <w:lang w:val="en-US"/>
         </w:rPr>
-        <w:t xml:space="preserve">Expected time to run: 37.46 hours. </w:t>
+        <w:t>Time to run: Mostly happened before midnight and was started at 20:30 so approximately 4.5 hours</w:t>
       </w:r>
     </w:p>
     <w:p>
@@ -57,34 +195,26 @@
         <w:rPr>
           <w:lang w:val="en-US"/>
         </w:rPr>
-        <w:t>Expected ChatGPT costs: $0.26 / 383 * 770 * 26 = £13.59</w:t>
+        <w:t>ChatGPT costs: 10.29 – 2.43 = $7.86</w:t>
       </w:r>
     </w:p>
     <w:p>
       <w:pPr>
         <w:rPr>
-          <w:lang w:val="en-US"/>
-        </w:rPr>
-      </w:pPr>
-      <w:r>
-        <w:rPr>
-          <w:lang w:val="en-US"/>
-        </w:rPr>
-        <w:t xml:space="preserve">Expected AWS </w:t>
-      </w:r>
-      <w:proofErr w:type="gramStart"/>
-      <w:r>
-        <w:rPr>
-          <w:lang w:val="en-US"/>
-        </w:rPr>
-        <w:t>costs:$</w:t>
-      </w:r>
-      <w:proofErr w:type="gramEnd"/>
-      <w:r>
-        <w:rPr>
-          <w:lang w:val="en-US"/>
-        </w:rPr>
-        <w:t>3.82 / 383 * 770 * 26 = £199?!</w:t>
+          <w:b/>
+          <w:bCs/>
+          <w:u w:val="single"/>
+          <w:lang w:val="en-US"/>
+        </w:rPr>
+      </w:pPr>
+      <w:r>
+        <w:rPr>
+          <w:b/>
+          <w:bCs/>
+          <w:u w:val="single"/>
+          <w:lang w:val="en-US"/>
+        </w:rPr>
+        <w:t>Running on two weeks (to test for one year overnight)</w:t>
       </w:r>
     </w:p>
     <w:p>
@@ -93,6 +223,30 @@
           <w:lang w:val="en-US"/>
         </w:rPr>
       </w:pPr>
+      <w:r>
+        <w:rPr>
+          <w:lang w:val="en-US"/>
+        </w:rPr>
+        <w:t>Run period: 2021-03-11 – 202</w:t>
+      </w:r>
+      <w:r>
+        <w:rPr>
+          <w:lang w:val="en-US"/>
+        </w:rPr>
+        <w:t>1</w:t>
+      </w:r>
+      <w:r>
+        <w:rPr>
+          <w:lang w:val="en-US"/>
+        </w:rPr>
+        <w:t>-03-2</w:t>
+      </w:r>
+      <w:r>
+        <w:rPr>
+          <w:lang w:val="en-US"/>
+        </w:rPr>
+        <w:t>4</w:t>
+      </w:r>
     </w:p>
     <w:p>
       <w:pPr>
@@ -100,6 +254,24 @@
           <w:lang w:val="en-US"/>
         </w:rPr>
       </w:pPr>
+      <w:r>
+        <w:rPr>
+          <w:lang w:val="en-US"/>
+        </w:rPr>
+        <w:t>Time to run:</w:t>
+      </w:r>
+      <w:r>
+        <w:rPr>
+          <w:lang w:val="en-US"/>
+        </w:rPr>
+        <w:t xml:space="preserve"> 13:00 BUT ISSUES.</w:t>
+      </w:r>
+      <w:r>
+        <w:rPr>
+          <w:lang w:val="en-US"/>
+        </w:rPr>
+        <w:t xml:space="preserve"> (338 mins or 5.6 hours)</w:t>
+      </w:r>
     </w:p>
     <w:p>
       <w:pPr>
@@ -111,7 +283,37 @@
         <w:rPr>
           <w:lang w:val="en-US"/>
         </w:rPr>
-        <w:t xml:space="preserve">CALCULATIONS: 55 rows per day. I got 383 rows and it took 43 minutes. </w:t>
+        <w:t>ChatGPT costs:</w:t>
+      </w:r>
+      <w:r>
+        <w:rPr>
+          <w:lang w:val="en-US"/>
+        </w:rPr>
+        <w:t xml:space="preserve"> </w:t>
+      </w:r>
+      <w:r>
+        <w:rPr>
+          <w:lang w:val="en-US"/>
+        </w:rPr>
+        <w:t>2.43</w:t>
+      </w:r>
+      <w:r>
+        <w:rPr>
+          <w:lang w:val="en-US"/>
+        </w:rPr>
+        <w:t xml:space="preserve"> – 2.28</w:t>
+      </w:r>
+      <w:r>
+        <w:rPr>
+          <w:lang w:val="en-US"/>
+        </w:rPr>
+        <w:t xml:space="preserve"> = 0.15</w:t>
+      </w:r>
+      <w:r>
+        <w:rPr>
+          <w:lang w:val="en-US"/>
+        </w:rPr>
+        <w:t xml:space="preserve"> ($3.90)</w:t>
       </w:r>
     </w:p>
     <w:p>
@@ -124,375 +326,14 @@
         <w:rPr>
           <w:lang w:val="en-US"/>
         </w:rPr>
-        <w:t xml:space="preserve">55*14 = 770. So average per 2 weeks is 86 minutes. </w:t>
-      </w:r>
-    </w:p>
-    <w:p>
-      <w:pPr>
-        <w:rPr>
-          <w:lang w:val="en-US"/>
-        </w:rPr>
-      </w:pPr>
-      <w:r>
-        <w:rPr>
-          <w:lang w:val="en-US"/>
-        </w:rPr>
-        <w:t xml:space="preserve">So average for 1 year is 2247.68 minutes = 37.46 hours.  </w:t>
-      </w:r>
-    </w:p>
-    <w:p>
-      <w:pPr>
-        <w:rPr>
-          <w:lang w:val="en-US"/>
-        </w:rPr>
-      </w:pPr>
-    </w:p>
-    <w:p>
-      <w:pPr>
-        <w:rPr>
-          <w:lang w:val="en-US"/>
-        </w:rPr>
-      </w:pPr>
-    </w:p>
-    <w:p>
-      <w:pPr>
-        <w:rPr>
-          <w:lang w:val="en-US"/>
-        </w:rPr>
-      </w:pPr>
-      <w:r>
-        <w:rPr>
-          <w:lang w:val="en-US"/>
-        </w:rPr>
-        <w:t xml:space="preserve">Okay so this is completely unreasonable. Specifically time and expected AWS costs. </w:t>
-      </w:r>
-    </w:p>
-    <w:p>
-      <w:pPr>
-        <w:rPr>
-          <w:lang w:val="en-US"/>
-        </w:rPr>
-      </w:pPr>
-      <w:r>
-        <w:rPr>
-          <w:lang w:val="en-US"/>
-        </w:rPr>
-        <w:t xml:space="preserve">For a 10-year dataset, 375 hours runtime (~15 days), £1990 AWS, £135 OpenAI. </w:t>
-      </w:r>
-    </w:p>
-    <w:p>
-      <w:pPr>
-        <w:rPr>
-          <w:lang w:val="en-US"/>
-        </w:rPr>
-      </w:pPr>
-      <w:r>
-        <w:rPr>
-          <w:lang w:val="en-US"/>
-        </w:rPr>
-        <w:t xml:space="preserve">I </w:t>
-      </w:r>
-      <w:proofErr w:type="gramStart"/>
-      <w:r>
-        <w:rPr>
-          <w:lang w:val="en-US"/>
-        </w:rPr>
-        <w:t>HAVE to</w:t>
-      </w:r>
-      <w:proofErr w:type="gramEnd"/>
-      <w:r>
-        <w:rPr>
-          <w:lang w:val="en-US"/>
-        </w:rPr>
-        <w:t xml:space="preserve"> implement a mining matcher. </w:t>
-      </w:r>
-    </w:p>
-    <w:p>
-      <w:pPr>
-        <w:rPr>
-          <w:lang w:val="en-US"/>
-        </w:rPr>
-      </w:pPr>
-    </w:p>
-    <w:p>
-      <w:pPr>
-        <w:spacing w:before="100" w:beforeAutospacing="1" w:after="100" w:afterAutospacing="1" w:line="240" w:lineRule="auto"/>
-        <w:outlineLvl w:val="2"/>
-        <w:rPr>
-          <w:rFonts w:ascii="Times New Roman" w:eastAsia="Times New Roman" w:hAnsi="Times New Roman" w:cs="Times New Roman"/>
-          <w:b/>
-          <w:bCs/>
-          <w:kern w:val="0"/>
-          <w:sz w:val="27"/>
-          <w:szCs w:val="27"/>
-          <w:lang w:eastAsia="en-GB"/>
-          <w14:ligatures w14:val="none"/>
-        </w:rPr>
-      </w:pPr>
-      <w:r>
-        <w:rPr>
-          <w:rFonts w:ascii="Times New Roman" w:eastAsia="Times New Roman" w:hAnsi="Times New Roman" w:cs="Times New Roman"/>
-          <w:b/>
-          <w:bCs/>
-          <w:kern w:val="0"/>
-          <w:sz w:val="27"/>
-          <w:szCs w:val="27"/>
-          <w:lang w:eastAsia="en-GB"/>
-          <w14:ligatures w14:val="none"/>
-        </w:rPr>
-        <w:t>1. Measure the Stage 1 funnel exactly</w:t>
-      </w:r>
-    </w:p>
-    <w:p>
-      <w:pPr>
-        <w:spacing w:before="100" w:beforeAutospacing="1" w:after="100" w:afterAutospacing="1" w:line="240" w:lineRule="auto"/>
-        <w:rPr>
-          <w:rFonts w:ascii="Times New Roman" w:eastAsia="Times New Roman" w:hAnsi="Times New Roman" w:cs="Times New Roman"/>
-          <w:kern w:val="0"/>
-          <w:lang w:eastAsia="en-GB"/>
-          <w14:ligatures w14:val="none"/>
-        </w:rPr>
-      </w:pPr>
-      <w:r>
-        <w:rPr>
-          <w:rFonts w:ascii="Times New Roman" w:eastAsia="Times New Roman" w:hAnsi="Times New Roman" w:cs="Times New Roman"/>
-          <w:kern w:val="0"/>
-          <w:lang w:eastAsia="en-GB"/>
-          <w14:ligatures w14:val="none"/>
-        </w:rPr>
-        <w:t>For one representative month, print:</w:t>
-      </w:r>
-    </w:p>
-    <w:p>
-      <w:pPr>
-        <w:numPr>
-          <w:ilvl w:val="0"/>
-          <w:numId w:val="1"/>
-        </w:numPr>
-        <w:spacing w:before="100" w:beforeAutospacing="1" w:after="100" w:afterAutospacing="1" w:line="240" w:lineRule="auto"/>
-        <w:rPr>
-          <w:rFonts w:ascii="Times New Roman" w:eastAsia="Times New Roman" w:hAnsi="Times New Roman" w:cs="Times New Roman"/>
-          <w:kern w:val="0"/>
-          <w:lang w:eastAsia="en-GB"/>
-          <w14:ligatures w14:val="none"/>
-        </w:rPr>
-      </w:pPr>
-      <w:r>
-        <w:rPr>
-          <w:rFonts w:ascii="Times New Roman" w:eastAsia="Times New Roman" w:hAnsi="Times New Roman" w:cs="Times New Roman"/>
-          <w:kern w:val="0"/>
-          <w:lang w:eastAsia="en-GB"/>
-          <w14:ligatures w14:val="none"/>
-        </w:rPr>
-        <w:t>rows after Zambia filter</w:t>
-      </w:r>
-    </w:p>
-    <w:p>
-      <w:pPr>
-        <w:numPr>
-          <w:ilvl w:val="0"/>
-          <w:numId w:val="1"/>
-        </w:numPr>
-        <w:spacing w:before="100" w:beforeAutospacing="1" w:after="100" w:afterAutospacing="1" w:line="240" w:lineRule="auto"/>
-        <w:rPr>
-          <w:rFonts w:ascii="Times New Roman" w:eastAsia="Times New Roman" w:hAnsi="Times New Roman" w:cs="Times New Roman"/>
-          <w:kern w:val="0"/>
-          <w:lang w:eastAsia="en-GB"/>
-          <w14:ligatures w14:val="none"/>
-        </w:rPr>
-      </w:pPr>
-      <w:r>
-        <w:rPr>
-          <w:rFonts w:ascii="Times New Roman" w:eastAsia="Times New Roman" w:hAnsi="Times New Roman" w:cs="Times New Roman"/>
-          <w:kern w:val="0"/>
-          <w:lang w:eastAsia="en-GB"/>
-          <w14:ligatures w14:val="none"/>
-        </w:rPr>
-        <w:t xml:space="preserve">rows after </w:t>
-      </w:r>
-      <w:proofErr w:type="gramStart"/>
-      <w:r>
-        <w:rPr>
-          <w:rFonts w:ascii="Times New Roman" w:eastAsia="Times New Roman" w:hAnsi="Times New Roman" w:cs="Times New Roman"/>
-          <w:kern w:val="0"/>
-          <w:lang w:eastAsia="en-GB"/>
-          <w14:ligatures w14:val="none"/>
-        </w:rPr>
-        <w:t>dedupe</w:t>
-      </w:r>
-      <w:proofErr w:type="gramEnd"/>
-    </w:p>
-    <w:p>
-      <w:pPr>
-        <w:numPr>
-          <w:ilvl w:val="0"/>
-          <w:numId w:val="1"/>
-        </w:numPr>
-        <w:spacing w:before="100" w:beforeAutospacing="1" w:after="100" w:afterAutospacing="1" w:line="240" w:lineRule="auto"/>
-        <w:rPr>
-          <w:rFonts w:ascii="Times New Roman" w:eastAsia="Times New Roman" w:hAnsi="Times New Roman" w:cs="Times New Roman"/>
-          <w:kern w:val="0"/>
-          <w:lang w:eastAsia="en-GB"/>
-          <w14:ligatures w14:val="none"/>
-        </w:rPr>
-      </w:pPr>
-      <w:r>
-        <w:rPr>
-          <w:rFonts w:ascii="Times New Roman" w:eastAsia="Times New Roman" w:hAnsi="Times New Roman" w:cs="Times New Roman"/>
-          <w:kern w:val="0"/>
-          <w:lang w:eastAsia="en-GB"/>
-          <w14:ligatures w14:val="none"/>
-        </w:rPr>
-        <w:t>rows after mining matcher</w:t>
-      </w:r>
-    </w:p>
-    <w:p>
-      <w:pPr>
-        <w:numPr>
-          <w:ilvl w:val="0"/>
-          <w:numId w:val="1"/>
-        </w:numPr>
-        <w:spacing w:before="100" w:beforeAutospacing="1" w:after="100" w:afterAutospacing="1" w:line="240" w:lineRule="auto"/>
-        <w:rPr>
-          <w:rFonts w:ascii="Times New Roman" w:eastAsia="Times New Roman" w:hAnsi="Times New Roman" w:cs="Times New Roman"/>
-          <w:kern w:val="0"/>
-          <w:lang w:eastAsia="en-GB"/>
-          <w14:ligatures w14:val="none"/>
-        </w:rPr>
-      </w:pPr>
-      <w:r>
-        <w:rPr>
-          <w:rFonts w:ascii="Times New Roman" w:eastAsia="Times New Roman" w:hAnsi="Times New Roman" w:cs="Times New Roman"/>
-          <w:kern w:val="0"/>
-          <w:lang w:eastAsia="en-GB"/>
-          <w14:ligatures w14:val="none"/>
-        </w:rPr>
-        <w:t>rows sent to Stage 1</w:t>
-      </w:r>
-    </w:p>
-    <w:p>
-      <w:pPr>
-        <w:numPr>
-          <w:ilvl w:val="0"/>
-          <w:numId w:val="1"/>
-        </w:numPr>
-        <w:spacing w:before="100" w:beforeAutospacing="1" w:after="100" w:afterAutospacing="1" w:line="240" w:lineRule="auto"/>
-        <w:rPr>
-          <w:rFonts w:ascii="Times New Roman" w:eastAsia="Times New Roman" w:hAnsi="Times New Roman" w:cs="Times New Roman"/>
-          <w:kern w:val="0"/>
-          <w:lang w:eastAsia="en-GB"/>
-          <w14:ligatures w14:val="none"/>
-        </w:rPr>
-      </w:pPr>
-      <w:r>
-        <w:rPr>
-          <w:rFonts w:ascii="Times New Roman" w:eastAsia="Times New Roman" w:hAnsi="Times New Roman" w:cs="Times New Roman"/>
-          <w:kern w:val="0"/>
-          <w:lang w:eastAsia="en-GB"/>
-          <w14:ligatures w14:val="none"/>
-        </w:rPr>
-        <w:t>rows accepted by Stage 1</w:t>
-      </w:r>
-    </w:p>
-    <w:p>
-      <w:pPr>
-        <w:numPr>
-          <w:ilvl w:val="0"/>
-          <w:numId w:val="1"/>
-        </w:numPr>
-        <w:spacing w:before="100" w:beforeAutospacing="1" w:after="100" w:afterAutospacing="1" w:line="240" w:lineRule="auto"/>
-        <w:rPr>
-          <w:rFonts w:ascii="Times New Roman" w:eastAsia="Times New Roman" w:hAnsi="Times New Roman" w:cs="Times New Roman"/>
-          <w:kern w:val="0"/>
-          <w:lang w:eastAsia="en-GB"/>
-          <w14:ligatures w14:val="none"/>
-        </w:rPr>
-      </w:pPr>
-      <w:r>
-        <w:rPr>
-          <w:rFonts w:ascii="Times New Roman" w:eastAsia="Times New Roman" w:hAnsi="Times New Roman" w:cs="Times New Roman"/>
-          <w:kern w:val="0"/>
-          <w:lang w:eastAsia="en-GB"/>
-          <w14:ligatures w14:val="none"/>
-        </w:rPr>
-        <w:t>rows sent to Stage 2</w:t>
-      </w:r>
-    </w:p>
-    <w:p>
-      <w:pPr>
-        <w:spacing w:before="100" w:beforeAutospacing="1" w:after="100" w:afterAutospacing="1" w:line="240" w:lineRule="auto"/>
-        <w:rPr>
-          <w:rFonts w:ascii="Times New Roman" w:eastAsia="Times New Roman" w:hAnsi="Times New Roman" w:cs="Times New Roman"/>
-          <w:kern w:val="0"/>
-          <w:lang w:eastAsia="en-GB"/>
-          <w14:ligatures w14:val="none"/>
-        </w:rPr>
-      </w:pPr>
-      <w:r>
-        <w:rPr>
-          <w:rFonts w:ascii="Times New Roman" w:eastAsia="Times New Roman" w:hAnsi="Times New Roman" w:cs="Times New Roman"/>
-          <w:kern w:val="0"/>
-          <w:lang w:eastAsia="en-GB"/>
-          <w14:ligatures w14:val="none"/>
-        </w:rPr>
-        <w:t>That will reveal where the explosion is.</w:t>
-      </w:r>
-    </w:p>
-    <w:p>
-      <w:pPr>
-        <w:spacing w:before="100" w:beforeAutospacing="1" w:after="100" w:afterAutospacing="1" w:line="240" w:lineRule="auto"/>
-        <w:outlineLvl w:val="2"/>
-        <w:rPr>
-          <w:rFonts w:ascii="Times New Roman" w:eastAsia="Times New Roman" w:hAnsi="Times New Roman" w:cs="Times New Roman"/>
-          <w:b/>
-          <w:bCs/>
-          <w:kern w:val="0"/>
-          <w:sz w:val="27"/>
-          <w:szCs w:val="27"/>
-          <w:lang w:eastAsia="en-GB"/>
-          <w14:ligatures w14:val="none"/>
-        </w:rPr>
-      </w:pPr>
-      <w:r>
-        <w:rPr>
-          <w:rFonts w:ascii="Times New Roman" w:eastAsia="Times New Roman" w:hAnsi="Times New Roman" w:cs="Times New Roman"/>
-          <w:b/>
-          <w:bCs/>
-          <w:kern w:val="0"/>
-          <w:sz w:val="27"/>
-          <w:szCs w:val="27"/>
-          <w:lang w:eastAsia="en-GB"/>
-          <w14:ligatures w14:val="none"/>
-        </w:rPr>
-        <w:t>2. Build a broad pre-LLM mining matcher</w:t>
-      </w:r>
-    </w:p>
-    <w:p>
-      <w:pPr>
-        <w:spacing w:before="100" w:beforeAutospacing="1" w:after="100" w:afterAutospacing="1" w:line="240" w:lineRule="auto"/>
-        <w:rPr>
-          <w:rFonts w:ascii="Times New Roman" w:eastAsia="Times New Roman" w:hAnsi="Times New Roman" w:cs="Times New Roman"/>
-          <w:kern w:val="0"/>
-          <w:lang w:eastAsia="en-GB"/>
-          <w14:ligatures w14:val="none"/>
-        </w:rPr>
-      </w:pPr>
-      <w:r>
-        <w:rPr>
-          <w:rFonts w:ascii="Times New Roman" w:eastAsia="Times New Roman" w:hAnsi="Times New Roman" w:cs="Times New Roman"/>
-          <w:kern w:val="0"/>
-          <w:lang w:eastAsia="en-GB"/>
-          <w14:ligatures w14:val="none"/>
-        </w:rPr>
-        <w:t>This is probably your highest-value next step.</w:t>
-      </w:r>
-    </w:p>
-    <w:p>
-      <w:pPr>
-        <w:rPr>
-          <w:lang w:val="en-US"/>
-        </w:rPr>
-      </w:pPr>
+        <w:t xml:space="preserve">AWS costs: </w:t>
+      </w:r>
+      <w:r>
+        <w:rPr>
+          <w:lang w:val="en-US"/>
+        </w:rPr>
+        <w:t xml:space="preserve">Negligible. </w:t>
+      </w:r>
       <w:r>
         <w:rPr>
           <w:lang w:val="en-US"/>
@@ -513,6 +354,231 @@
 <file path=word/numbering.xml><?xml version="1.0" encoding="utf-8"?>
 <w:numbering xmlns:wpc="http://schemas.microsoft.com/office/word/2010/wordprocessingCanvas" xmlns:cx="http://schemas.microsoft.com/office/drawing/2014/chartex" xmlns:cx1="http://schemas.microsoft.com/office/drawing/2015/9/8/chartex" xmlns:cx2="http://schemas.microsoft.com/office/drawing/2015/10/21/chartex" xmlns:cx3="http://schemas.microsoft.com/office/drawing/2016/5/9/chartex" xmlns:cx4="http://schemas.microsoft.com/office/drawing/2016/5/10/chartex" xmlns:cx5="http://schemas.microsoft.com/office/drawing/2016/5/11/chartex" xmlns:cx6="http://schemas.microsoft.com/office/drawing/2016/5/12/chartex" xmlns:cx7="http://schemas.microsoft.com/office/drawing/2016/5/13/chartex" xmlns:cx8="http://schemas.microsoft.com/office/drawing/2016/5/14/chartex" xmlns:mc="http://schemas.openxmlformats.org/markup-compatibility/2006" xmlns:aink="http://schemas.microsoft.com/office/drawing/2016/ink" xmlns:am3d="http://schemas.microsoft.com/office/drawing/2017/model3d" xmlns:o="urn:schemas-microsoft-com:office:office" xmlns:oel="http://schemas.microsoft.com/office/2019/extlst" xmlns:r="http://schemas.openxmlformats.org/officeDocument/2006/relationships" xmlns:m="http://schemas.openxmlformats.org/officeDocument/2006/math" xmlns:v="urn:schemas-microsoft-com:vml" xmlns:wp14="http://schemas.microsoft.com/office/word/2010/wordprocessingDrawing" xmlns:wp="http://schemas.openxmlformats.org/drawingml/2006/wordprocessingDrawing" xmlns:w10="urn:schemas-microsoft-com:office:word" xmlns:w="http://schemas.openxmlformats.org/wordprocessingml/2006/main" xmlns:w14="http://schemas.microsoft.com/office/word/2010/wordml" xmlns:w15="http://schemas.microsoft.com/office/word/2012/wordml" xmlns:w16cex="http://schemas.microsoft.com/office/word/2018/wordml/cex" xmlns:w16cid="http://schemas.microsoft.com/office/word/2016/wordml/cid" xmlns:w16="http://schemas.microsoft.com/office/word/2018/wordml" xmlns:w16du="http://schemas.microsoft.com/office/word/2023/wordml/word16du" xmlns:w16sdtdh="http://schemas.microsoft.com/office/word/2020/wordml/sdtdatahash" xmlns:w16sdtfl="http://schemas.microsoft.com/office/word/2024/wordml/sdtformatlock" xmlns:w16se="http://schemas.microsoft.com/office/word/2015/wordml/symex" xmlns:wpg="http://schemas.microsoft.com/office/word/2010/wordprocessingGroup" xmlns:wpi="http://schemas.microsoft.com/office/word/2010/wordprocessingInk" xmlns:wne="http://schemas.microsoft.com/office/word/2006/wordml" xmlns:wps="http://schemas.microsoft.com/office/word/2010/wordprocessingShape" mc:Ignorable="w14 w15 w16se w16cid w16 w16cex w16sdtdh w16sdtfl w16du wp14">
   <w:abstractNum w:abstractNumId="0" w15:restartNumberingAfterBreak="0">
+    <w:nsid w:val="25E62250"/>
+    <w:multiLevelType w:val="hybridMultilevel"/>
+    <w:tmpl w:val="417CA52C"/>
+    <w:lvl w:ilvl="0" w:tplc="7062CF04">
+      <w:numFmt w:val="bullet"/>
+      <w:lvlText w:val="-"/>
+      <w:lvlJc w:val="left"/>
+      <w:pPr>
+        <w:ind w:left="720" w:hanging="360"/>
+      </w:pPr>
+      <w:rPr>
+        <w:rFonts w:ascii="Aptos" w:eastAsiaTheme="minorHAnsi" w:hAnsi="Aptos" w:cstheme="minorBidi" w:hint="default"/>
+      </w:rPr>
+    </w:lvl>
+    <w:lvl w:ilvl="1" w:tplc="08090003" w:tentative="1">
+      <w:start w:val="1"/>
+      <w:numFmt w:val="bullet"/>
+      <w:lvlText w:val="o"/>
+      <w:lvlJc w:val="left"/>
+      <w:pPr>
+        <w:ind w:left="1440" w:hanging="360"/>
+      </w:pPr>
+      <w:rPr>
+        <w:rFonts w:ascii="Courier New" w:hAnsi="Courier New" w:cs="Courier New" w:hint="default"/>
+      </w:rPr>
+    </w:lvl>
+    <w:lvl w:ilvl="2" w:tplc="08090005" w:tentative="1">
+      <w:start w:val="1"/>
+      <w:numFmt w:val="bullet"/>
+      <w:lvlText w:val=""/>
+      <w:lvlJc w:val="left"/>
+      <w:pPr>
+        <w:ind w:left="2160" w:hanging="360"/>
+      </w:pPr>
+      <w:rPr>
+        <w:rFonts w:ascii="Wingdings" w:hAnsi="Wingdings" w:hint="default"/>
+      </w:rPr>
+    </w:lvl>
+    <w:lvl w:ilvl="3" w:tplc="08090001" w:tentative="1">
+      <w:start w:val="1"/>
+      <w:numFmt w:val="bullet"/>
+      <w:lvlText w:val=""/>
+      <w:lvlJc w:val="left"/>
+      <w:pPr>
+        <w:ind w:left="2880" w:hanging="360"/>
+      </w:pPr>
+      <w:rPr>
+        <w:rFonts w:ascii="Symbol" w:hAnsi="Symbol" w:hint="default"/>
+      </w:rPr>
+    </w:lvl>
+    <w:lvl w:ilvl="4" w:tplc="08090003" w:tentative="1">
+      <w:start w:val="1"/>
+      <w:numFmt w:val="bullet"/>
+      <w:lvlText w:val="o"/>
+      <w:lvlJc w:val="left"/>
+      <w:pPr>
+        <w:ind w:left="3600" w:hanging="360"/>
+      </w:pPr>
+      <w:rPr>
+        <w:rFonts w:ascii="Courier New" w:hAnsi="Courier New" w:cs="Courier New" w:hint="default"/>
+      </w:rPr>
+    </w:lvl>
+    <w:lvl w:ilvl="5" w:tplc="08090005" w:tentative="1">
+      <w:start w:val="1"/>
+      <w:numFmt w:val="bullet"/>
+      <w:lvlText w:val=""/>
+      <w:lvlJc w:val="left"/>
+      <w:pPr>
+        <w:ind w:left="4320" w:hanging="360"/>
+      </w:pPr>
+      <w:rPr>
+        <w:rFonts w:ascii="Wingdings" w:hAnsi="Wingdings" w:hint="default"/>
+      </w:rPr>
+    </w:lvl>
+    <w:lvl w:ilvl="6" w:tplc="08090001" w:tentative="1">
+      <w:start w:val="1"/>
+      <w:numFmt w:val="bullet"/>
+      <w:lvlText w:val=""/>
+      <w:lvlJc w:val="left"/>
+      <w:pPr>
+        <w:ind w:left="5040" w:hanging="360"/>
+      </w:pPr>
+      <w:rPr>
+        <w:rFonts w:ascii="Symbol" w:hAnsi="Symbol" w:hint="default"/>
+      </w:rPr>
+    </w:lvl>
+    <w:lvl w:ilvl="7" w:tplc="08090003" w:tentative="1">
+      <w:start w:val="1"/>
+      <w:numFmt w:val="bullet"/>
+      <w:lvlText w:val="o"/>
+      <w:lvlJc w:val="left"/>
+      <w:pPr>
+        <w:ind w:left="5760" w:hanging="360"/>
+      </w:pPr>
+      <w:rPr>
+        <w:rFonts w:ascii="Courier New" w:hAnsi="Courier New" w:cs="Courier New" w:hint="default"/>
+      </w:rPr>
+    </w:lvl>
+    <w:lvl w:ilvl="8" w:tplc="08090005" w:tentative="1">
+      <w:start w:val="1"/>
+      <w:numFmt w:val="bullet"/>
+      <w:lvlText w:val=""/>
+      <w:lvlJc w:val="left"/>
+      <w:pPr>
+        <w:ind w:left="6480" w:hanging="360"/>
+      </w:pPr>
+      <w:rPr>
+        <w:rFonts w:ascii="Wingdings" w:hAnsi="Wingdings" w:hint="default"/>
+      </w:rPr>
+    </w:lvl>
+  </w:abstractNum>
+  <w:abstractNum w:abstractNumId="1" w15:restartNumberingAfterBreak="0">
+    <w:nsid w:val="63DF3C7C"/>
+    <w:multiLevelType w:val="hybridMultilevel"/>
+    <w:tmpl w:val="6244249C"/>
+    <w:lvl w:ilvl="0" w:tplc="08090001">
+      <w:start w:val="1"/>
+      <w:numFmt w:val="bullet"/>
+      <w:lvlText w:val=""/>
+      <w:lvlJc w:val="left"/>
+      <w:pPr>
+        <w:ind w:left="720" w:hanging="360"/>
+      </w:pPr>
+      <w:rPr>
+        <w:rFonts w:ascii="Symbol" w:hAnsi="Symbol" w:hint="default"/>
+      </w:rPr>
+    </w:lvl>
+    <w:lvl w:ilvl="1" w:tplc="08090003">
+      <w:start w:val="1"/>
+      <w:numFmt w:val="bullet"/>
+      <w:lvlText w:val="o"/>
+      <w:lvlJc w:val="left"/>
+      <w:pPr>
+        <w:ind w:left="1440" w:hanging="360"/>
+      </w:pPr>
+      <w:rPr>
+        <w:rFonts w:ascii="Courier New" w:hAnsi="Courier New" w:cs="Courier New" w:hint="default"/>
+      </w:rPr>
+    </w:lvl>
+    <w:lvl w:ilvl="2" w:tplc="08090005" w:tentative="1">
+      <w:start w:val="1"/>
+      <w:numFmt w:val="bullet"/>
+      <w:lvlText w:val=""/>
+      <w:lvlJc w:val="left"/>
+      <w:pPr>
+        <w:ind w:left="2160" w:hanging="360"/>
+      </w:pPr>
+      <w:rPr>
+        <w:rFonts w:ascii="Wingdings" w:hAnsi="Wingdings" w:hint="default"/>
+      </w:rPr>
+    </w:lvl>
+    <w:lvl w:ilvl="3" w:tplc="08090001" w:tentative="1">
+      <w:start w:val="1"/>
+      <w:numFmt w:val="bullet"/>
+      <w:lvlText w:val=""/>
+      <w:lvlJc w:val="left"/>
+      <w:pPr>
+        <w:ind w:left="2880" w:hanging="360"/>
+      </w:pPr>
+      <w:rPr>
+        <w:rFonts w:ascii="Symbol" w:hAnsi="Symbol" w:hint="default"/>
+      </w:rPr>
+    </w:lvl>
+    <w:lvl w:ilvl="4" w:tplc="08090003" w:tentative="1">
+      <w:start w:val="1"/>
+      <w:numFmt w:val="bullet"/>
+      <w:lvlText w:val="o"/>
+      <w:lvlJc w:val="left"/>
+      <w:pPr>
+        <w:ind w:left="3600" w:hanging="360"/>
+      </w:pPr>
+      <w:rPr>
+        <w:rFonts w:ascii="Courier New" w:hAnsi="Courier New" w:cs="Courier New" w:hint="default"/>
+      </w:rPr>
+    </w:lvl>
+    <w:lvl w:ilvl="5" w:tplc="08090005" w:tentative="1">
+      <w:start w:val="1"/>
+      <w:numFmt w:val="bullet"/>
+      <w:lvlText w:val=""/>
+      <w:lvlJc w:val="left"/>
+      <w:pPr>
+        <w:ind w:left="4320" w:hanging="360"/>
+      </w:pPr>
+      <w:rPr>
+        <w:rFonts w:ascii="Wingdings" w:hAnsi="Wingdings" w:hint="default"/>
+      </w:rPr>
+    </w:lvl>
+    <w:lvl w:ilvl="6" w:tplc="08090001" w:tentative="1">
+      <w:start w:val="1"/>
+      <w:numFmt w:val="bullet"/>
+      <w:lvlText w:val=""/>
+      <w:lvlJc w:val="left"/>
+      <w:pPr>
+        <w:ind w:left="5040" w:hanging="360"/>
+      </w:pPr>
+      <w:rPr>
+        <w:rFonts w:ascii="Symbol" w:hAnsi="Symbol" w:hint="default"/>
+      </w:rPr>
+    </w:lvl>
+    <w:lvl w:ilvl="7" w:tplc="08090003" w:tentative="1">
+      <w:start w:val="1"/>
+      <w:numFmt w:val="bullet"/>
+      <w:lvlText w:val="o"/>
+      <w:lvlJc w:val="left"/>
+      <w:pPr>
+        <w:ind w:left="5760" w:hanging="360"/>
+      </w:pPr>
+      <w:rPr>
+        <w:rFonts w:ascii="Courier New" w:hAnsi="Courier New" w:cs="Courier New" w:hint="default"/>
+      </w:rPr>
+    </w:lvl>
+    <w:lvl w:ilvl="8" w:tplc="08090005" w:tentative="1">
+      <w:start w:val="1"/>
+      <w:numFmt w:val="bullet"/>
+      <w:lvlText w:val=""/>
+      <w:lvlJc w:val="left"/>
+      <w:pPr>
+        <w:ind w:left="6480" w:hanging="360"/>
+      </w:pPr>
+      <w:rPr>
+        <w:rFonts w:ascii="Wingdings" w:hAnsi="Wingdings" w:hint="default"/>
+      </w:rPr>
+    </w:lvl>
+  </w:abstractNum>
+  <w:abstractNum w:abstractNumId="2" w15:restartNumberingAfterBreak="0">
     <w:nsid w:val="72877117"/>
     <w:multiLevelType w:val="multilevel"/>
     <w:tmpl w:val="B7EA3780"/>
@@ -662,7 +728,13 @@
     </w:lvl>
   </w:abstractNum>
   <w:num w:numId="1" w16cid:durableId="1181630476">
+    <w:abstractNumId w:val="2"/>
+  </w:num>
+  <w:num w:numId="2" w16cid:durableId="1067387625">
     <w:abstractNumId w:val="0"/>
+  </w:num>
+  <w:num w:numId="3" w16cid:durableId="270170546">
+    <w:abstractNumId w:val="1"/>
   </w:num>
 </w:numbering>
 </file>

</xml_diff>

<commit_message>
Fixed Wayback Machine Use
</commit_message>
<xml_diff>
--- a/STEPS.docx
+++ b/STEPS.docx
@@ -44,7 +44,7 @@
       <w:pPr>
         <w:pStyle w:val="ListParagraph"/>
         <w:numPr>
-          <w:ilvl w:val="0"/>
+          <w:ilvl w:val="1"/>
           <w:numId w:val="3"/>
         </w:numPr>
         <w:rPr>
@@ -55,7 +55,7 @@
         <w:rPr>
           <w:lang w:val="en-US"/>
         </w:rPr>
-        <w:t>Check I can do everything else on my laptop while running on 4 more years</w:t>
+        <w:t>Ask ChatGPT what we can do about this issue as it seems quite severe</w:t>
       </w:r>
     </w:p>
     <w:p>
@@ -73,7 +73,89 @@
         <w:rPr>
           <w:lang w:val="en-US"/>
         </w:rPr>
-        <w:t xml:space="preserve">Locally yes, AWS be careful due to memory constraints. </w:t>
+        <w:t>Wayback machine</w:t>
+      </w:r>
+    </w:p>
+    <w:p>
+      <w:pPr>
+        <w:pStyle w:val="ListParagraph"/>
+        <w:numPr>
+          <w:ilvl w:val="1"/>
+          <w:numId w:val="3"/>
+        </w:numPr>
+        <w:rPr>
+          <w:lang w:val="en-US"/>
+        </w:rPr>
+      </w:pPr>
+      <w:r>
+        <w:rPr>
+          <w:lang w:val="en-US"/>
+        </w:rPr>
+        <w:t>Use of metadata if full article cannot be scraped</w:t>
+      </w:r>
+    </w:p>
+    <w:p>
+      <w:pPr>
+        <w:pStyle w:val="ListParagraph"/>
+        <w:numPr>
+          <w:ilvl w:val="1"/>
+          <w:numId w:val="3"/>
+        </w:numPr>
+        <w:rPr>
+          <w:lang w:val="en-US"/>
+        </w:rPr>
+      </w:pPr>
+      <w:r>
+        <w:rPr>
+          <w:lang w:val="en-US"/>
+        </w:rPr>
+        <w:t xml:space="preserve">Looking at 2016: Did take a while before. Only 87? made it to second classifier out of like 1000. We should hope for less than 1000 going into first classifier. And </w:t>
+      </w:r>
+      <w:proofErr w:type="spellStart"/>
+      <w:r>
+        <w:rPr>
+          <w:lang w:val="en-US"/>
+        </w:rPr>
+        <w:t>mining_matcher</w:t>
+      </w:r>
+      <w:proofErr w:type="spellEnd"/>
+      <w:r>
+        <w:rPr>
+          <w:lang w:val="en-US"/>
+        </w:rPr>
+        <w:t xml:space="preserve"> not taking too much longer. </w:t>
+      </w:r>
+    </w:p>
+    <w:p>
+      <w:pPr>
+        <w:pStyle w:val="ListParagraph"/>
+        <w:numPr>
+          <w:ilvl w:val="1"/>
+          <w:numId w:val="3"/>
+        </w:numPr>
+        <w:rPr>
+          <w:lang w:val="en-US"/>
+        </w:rPr>
+      </w:pPr>
+      <w:r>
+        <w:rPr>
+          <w:lang w:val="en-US"/>
+        </w:rPr>
+        <w:t xml:space="preserve">I have used </w:t>
+      </w:r>
+      <w:proofErr w:type="gramStart"/>
+      <w:r>
+        <w:rPr>
+          <w:lang w:val="en-US"/>
+        </w:rPr>
+        <w:t>Wayback,</w:t>
+      </w:r>
+      <w:proofErr w:type="gramEnd"/>
+      <w:r>
+        <w:rPr>
+          <w:lang w:val="en-US"/>
+        </w:rPr>
+        <w:t xml:space="preserve"> I am unsure if it is </w:t>
       </w:r>
     </w:p>
     <w:p>
@@ -84,14 +166,76 @@
           <w:numId w:val="3"/>
         </w:numPr>
         <w:rPr>
-          <w:lang w:val="en-US"/>
-        </w:rPr>
-      </w:pPr>
-      <w:r>
-        <w:rPr>
+          <w:highlight w:val="yellow"/>
+          <w:lang w:val="en-US"/>
+        </w:rPr>
+      </w:pPr>
+      <w:r>
+        <w:rPr>
+          <w:highlight w:val="yellow"/>
+          <w:lang w:val="en-US"/>
+        </w:rPr>
+        <w:t>Check I can do everything else on my laptop while running on 4 more years</w:t>
+      </w:r>
+    </w:p>
+    <w:p>
+      <w:pPr>
+        <w:pStyle w:val="ListParagraph"/>
+        <w:numPr>
+          <w:ilvl w:val="1"/>
+          <w:numId w:val="3"/>
+        </w:numPr>
+        <w:rPr>
+          <w:highlight w:val="yellow"/>
+          <w:lang w:val="en-US"/>
+        </w:rPr>
+      </w:pPr>
+      <w:r>
+        <w:rPr>
+          <w:highlight w:val="yellow"/>
+          <w:lang w:val="en-US"/>
+        </w:rPr>
+        <w:t xml:space="preserve">Locally yes, AWS be careful due to memory constraints. </w:t>
+      </w:r>
+    </w:p>
+    <w:p>
+      <w:pPr>
+        <w:pStyle w:val="ListParagraph"/>
+        <w:numPr>
+          <w:ilvl w:val="0"/>
+          <w:numId w:val="3"/>
+        </w:numPr>
+        <w:rPr>
+          <w:highlight w:val="yellow"/>
+          <w:lang w:val="en-US"/>
+        </w:rPr>
+      </w:pPr>
+      <w:r>
+        <w:rPr>
+          <w:highlight w:val="yellow"/>
           <w:lang w:val="en-US"/>
         </w:rPr>
         <w:t>Check my S3 storage isn’t going to overwrite my current files</w:t>
+      </w:r>
+    </w:p>
+    <w:p>
+      <w:pPr>
+        <w:pStyle w:val="ListParagraph"/>
+        <w:numPr>
+          <w:ilvl w:val="1"/>
+          <w:numId w:val="3"/>
+        </w:numPr>
+        <w:rPr>
+          <w:highlight w:val="yellow"/>
+          <w:lang w:val="en-US"/>
+        </w:rPr>
+      </w:pPr>
+      <w:r>
+        <w:rPr>
+          <w:highlight w:val="yellow"/>
+          <w:lang w:val="en-US"/>
+        </w:rPr>
+        <w:t>It is not</w:t>
       </w:r>
     </w:p>
     <w:p>

</xml_diff>

<commit_message>
Updated to introduce the step where if scraping and wayback fail but metadata succeeds, metadate is passed into stage2 classifier
</commit_message>
<xml_diff>
--- a/STEPS.docx
+++ b/STEPS.docx
@@ -30,11 +30,13 @@
           <w:numId w:val="3"/>
         </w:numPr>
         <w:rPr>
-          <w:lang w:val="en-US"/>
-        </w:rPr>
-      </w:pPr>
-      <w:r>
-        <w:rPr>
+          <w:highlight w:val="yellow"/>
+          <w:lang w:val="en-US"/>
+        </w:rPr>
+      </w:pPr>
+      <w:r>
+        <w:rPr>
+          <w:highlight w:val="yellow"/>
           <w:lang w:val="en-US"/>
         </w:rPr>
         <w:t>Check ‘link rot’ issue across 2 more random weeks in 2016 &amp; 2022</w:t>
@@ -48,11 +50,13 @@
           <w:numId w:val="3"/>
         </w:numPr>
         <w:rPr>
-          <w:lang w:val="en-US"/>
-        </w:rPr>
-      </w:pPr>
-      <w:r>
-        <w:rPr>
+          <w:highlight w:val="yellow"/>
+          <w:lang w:val="en-US"/>
+        </w:rPr>
+      </w:pPr>
+      <w:r>
+        <w:rPr>
+          <w:highlight w:val="yellow"/>
           <w:lang w:val="en-US"/>
         </w:rPr>
         <w:t>Ask ChatGPT what we can do about this issue as it seems quite severe</w:t>
@@ -66,11 +70,13 @@
           <w:numId w:val="3"/>
         </w:numPr>
         <w:rPr>
-          <w:lang w:val="en-US"/>
-        </w:rPr>
-      </w:pPr>
-      <w:r>
-        <w:rPr>
+          <w:highlight w:val="yellow"/>
+          <w:lang w:val="en-US"/>
+        </w:rPr>
+      </w:pPr>
+      <w:r>
+        <w:rPr>
+          <w:highlight w:val="yellow"/>
           <w:lang w:val="en-US"/>
         </w:rPr>
         <w:t>Wayback machine</w:t>
@@ -84,11 +90,13 @@
           <w:numId w:val="3"/>
         </w:numPr>
         <w:rPr>
-          <w:lang w:val="en-US"/>
-        </w:rPr>
-      </w:pPr>
-      <w:r>
-        <w:rPr>
+          <w:highlight w:val="yellow"/>
+          <w:lang w:val="en-US"/>
+        </w:rPr>
+      </w:pPr>
+      <w:r>
+        <w:rPr>
+          <w:highlight w:val="yellow"/>
           <w:lang w:val="en-US"/>
         </w:rPr>
         <w:t>Use of metadata if full article cannot be scraped</w:t>
@@ -102,11 +110,13 @@
           <w:numId w:val="3"/>
         </w:numPr>
         <w:rPr>
-          <w:lang w:val="en-US"/>
-        </w:rPr>
-      </w:pPr>
-      <w:r>
-        <w:rPr>
+          <w:highlight w:val="yellow"/>
+          <w:lang w:val="en-US"/>
+        </w:rPr>
+      </w:pPr>
+      <w:r>
+        <w:rPr>
+          <w:highlight w:val="yellow"/>
           <w:lang w:val="en-US"/>
         </w:rPr>
         <w:t xml:space="preserve">Looking at 2016: Did take a while before. Only 87? made it to second classifier out of like 1000. We should hope for less than 1000 going into first classifier. And </w:t>
@@ -114,6 +124,7 @@
       <w:proofErr w:type="spellStart"/>
       <w:r>
         <w:rPr>
+          <w:highlight w:val="yellow"/>
           <w:lang w:val="en-US"/>
         </w:rPr>
         <w:t>mining_matcher</w:t>
@@ -121,6 +132,7 @@
       <w:proofErr w:type="spellEnd"/>
       <w:r>
         <w:rPr>
+          <w:highlight w:val="yellow"/>
           <w:lang w:val="en-US"/>
         </w:rPr>
         <w:t xml:space="preserve"> not taking too much longer. </w:t>
@@ -134,11 +146,13 @@
           <w:numId w:val="3"/>
         </w:numPr>
         <w:rPr>
-          <w:lang w:val="en-US"/>
-        </w:rPr>
-      </w:pPr>
-      <w:r>
-        <w:rPr>
+          <w:highlight w:val="yellow"/>
+          <w:lang w:val="en-US"/>
+        </w:rPr>
+      </w:pPr>
+      <w:r>
+        <w:rPr>
+          <w:highlight w:val="yellow"/>
           <w:lang w:val="en-US"/>
         </w:rPr>
         <w:t xml:space="preserve">I have used </w:t>
@@ -146,6 +160,7 @@
       <w:proofErr w:type="gramStart"/>
       <w:r>
         <w:rPr>
+          <w:highlight w:val="yellow"/>
           <w:lang w:val="en-US"/>
         </w:rPr>
         <w:t>Wayback,</w:t>
@@ -153,9 +168,84 @@
       <w:proofErr w:type="gramEnd"/>
       <w:r>
         <w:rPr>
+          <w:highlight w:val="yellow"/>
           <w:lang w:val="en-US"/>
         </w:rPr>
         <w:t xml:space="preserve"> I am unsure if it is </w:t>
+      </w:r>
+    </w:p>
+    <w:p>
+      <w:pPr>
+        <w:pStyle w:val="ListParagraph"/>
+        <w:numPr>
+          <w:ilvl w:val="1"/>
+          <w:numId w:val="3"/>
+        </w:numPr>
+        <w:rPr>
+          <w:lang w:val="en-US"/>
+        </w:rPr>
+      </w:pPr>
+      <w:r>
+        <w:rPr>
+          <w:lang w:val="en-US"/>
+        </w:rPr>
+        <w:t xml:space="preserve">I am satisfied Wayback is working. I guess my final questions is: If scrape fails and wayback also fails, the article will move to </w:t>
+      </w:r>
+      <w:proofErr w:type="spellStart"/>
+      <w:r>
+        <w:rPr>
+          <w:lang w:val="en-US"/>
+        </w:rPr>
+        <w:t>fetch_metadata</w:t>
+      </w:r>
+      <w:proofErr w:type="spellEnd"/>
+      <w:r>
+        <w:rPr>
+          <w:lang w:val="en-US"/>
+        </w:rPr>
+        <w:t xml:space="preserve"> and llmstage1. For normal articles, this will decide </w:t>
+      </w:r>
+      <w:proofErr w:type="gramStart"/>
+      <w:r>
+        <w:rPr>
+          <w:lang w:val="en-US"/>
+        </w:rPr>
+        <w:t>definitely not</w:t>
+      </w:r>
+      <w:proofErr w:type="gramEnd"/>
+      <w:r>
+        <w:rPr>
+          <w:lang w:val="en-US"/>
+        </w:rPr>
+        <w:t xml:space="preserve"> mining but for failed articles and failed wayback that have metadata, this stage should </w:t>
+      </w:r>
+      <w:proofErr w:type="gramStart"/>
+      <w:r>
+        <w:rPr>
+          <w:lang w:val="en-US"/>
+        </w:rPr>
+        <w:t>actually be</w:t>
+      </w:r>
+      <w:proofErr w:type="gramEnd"/>
+      <w:r>
+        <w:rPr>
+          <w:lang w:val="en-US"/>
+        </w:rPr>
+        <w:t xml:space="preserve"> </w:t>
+      </w:r>
+      <w:proofErr w:type="gramStart"/>
+      <w:r>
+        <w:rPr>
+          <w:lang w:val="en-US"/>
+        </w:rPr>
+        <w:t>skipped</w:t>
+      </w:r>
+      <w:proofErr w:type="gramEnd"/>
+      <w:r>
+        <w:rPr>
+          <w:lang w:val="en-US"/>
+        </w:rPr>
+        <w:t xml:space="preserve"> and the metadata should be the input to stage 2 classifier. IMPLEMENT THIS AFTER LUNCH. </w:t>
       </w:r>
     </w:p>
     <w:p>

</xml_diff>